<commit_message>
clean up reports, produce manuscript figure
</commit_message>
<xml_diff>
--- a/Manuscripts/Botanical Hormesis Testing.docx
+++ b/Manuscripts/Botanical Hormesis Testing.docx
@@ -8,10 +8,12 @@
         <w:spacing w:line="240" w:lineRule="auto"/>
         <w:jc w:val="center"/>
       </w:pPr>
+      <w:bookmarkStart w:id="0" w:name="OLE_LINK4"/>
       <w:r>
         <w:t>Testing for Botanical Hormesis using Monotonicity</w:t>
       </w:r>
     </w:p>
+    <w:bookmarkEnd w:id="0"/>
     <w:p>
       <w:pPr>
         <w:spacing w:line="240" w:lineRule="auto"/>
@@ -633,12 +635,12 @@
       <w:r>
         <w:t xml:space="preserve"> mentioned, the search for hormesis often reduces to the search for dose response curves with J or inverted J shape. In other words, the response should have a slight dip at lower doses followed by an increasing tail, or a slight bump followed by a decreasing tail. The former corresponds to a convex </w:t>
       </w:r>
-      <w:ins w:id="0" w:author="Jin, Ying (NIH/NIEHS) [F]" w:date="2026-01-22T15:41:00Z" w16du:dateUtc="2026-01-22T20:41:00Z">
+      <w:ins w:id="1" w:author="Jin, Ying (NIH/NIEHS) [F]" w:date="2026-01-22T15:41:00Z" w16du:dateUtc="2026-01-22T20:41:00Z">
         <w:r>
           <w:t>curve with increasing trend</w:t>
         </w:r>
       </w:ins>
-      <w:del w:id="1" w:author="Jin, Ying (NIH/NIEHS) [F]" w:date="2026-01-22T15:41:00Z" w16du:dateUtc="2026-01-22T20:41:00Z">
+      <w:del w:id="2" w:author="Jin, Ying (NIH/NIEHS) [F]" w:date="2026-01-22T15:41:00Z" w16du:dateUtc="2026-01-22T20:41:00Z">
         <w:r>
           <w:delText>increasing curve</w:delText>
         </w:r>
@@ -646,12 +648,12 @@
       <w:r>
         <w:t xml:space="preserve">, and the latter a </w:t>
       </w:r>
-      <w:del w:id="2" w:author="Jin, Ying (NIH/NIEHS) [F]" w:date="2026-01-22T15:41:00Z" w16du:dateUtc="2026-01-22T20:41:00Z">
+      <w:del w:id="3" w:author="Jin, Ying (NIH/NIEHS) [F]" w:date="2026-01-22T15:41:00Z" w16du:dateUtc="2026-01-22T20:41:00Z">
         <w:r>
           <w:delText>concave decreasing curve</w:delText>
         </w:r>
       </w:del>
-      <w:ins w:id="3" w:author="Jin, Ying (NIH/NIEHS) [F]" w:date="2026-01-22T15:41:00Z" w16du:dateUtc="2026-01-22T20:41:00Z">
+      <w:ins w:id="4" w:author="Jin, Ying (NIH/NIEHS) [F]" w:date="2026-01-22T15:41:00Z" w16du:dateUtc="2026-01-22T20:41:00Z">
         <w:r>
           <w:t>concave curve with decreasing trend</w:t>
         </w:r>
@@ -659,7 +661,7 @@
       <w:r>
         <w:t xml:space="preserve">. It follows that a hormetic curve can be detected by testing for convexity.  Note that testing for monotonicity is not sufficient:  while all hormetic curves are non-monotonic, not all non-monotonic curves will have a J shape.  Furthermore, a dose response </w:t>
       </w:r>
-      <w:ins w:id="4" w:author="Jin, Ying (NIH/NIEHS) [F]" w:date="2026-01-22T15:42:00Z" w16du:dateUtc="2026-01-22T20:42:00Z">
+      <w:ins w:id="5" w:author="Jin, Ying (NIH/NIEHS) [F]" w:date="2026-01-22T15:42:00Z" w16du:dateUtc="2026-01-22T20:42:00Z">
         <w:r>
           <w:t xml:space="preserve">curve </w:t>
         </w:r>
@@ -667,7 +669,7 @@
       <w:r>
         <w:t>may be convex</w:t>
       </w:r>
-      <w:ins w:id="5" w:author="Jin, Ying (NIH/NIEHS) [F]" w:date="2026-01-22T15:42:00Z" w16du:dateUtc="2026-01-22T20:42:00Z">
+      <w:ins w:id="6" w:author="Jin, Ying (NIH/NIEHS) [F]" w:date="2026-01-22T15:42:00Z" w16du:dateUtc="2026-01-22T20:42:00Z">
         <w:r>
           <w:t>/concave</w:t>
         </w:r>
@@ -675,17 +677,17 @@
       <w:r>
         <w:t xml:space="preserve"> without having a J shape, so it is important to check </w:t>
       </w:r>
-      <w:ins w:id="6" w:author="Jin, Ying (NIH/NIEHS) [F]" w:date="2026-01-22T15:43:00Z" w16du:dateUtc="2026-01-22T20:43:00Z">
+      <w:ins w:id="7" w:author="Jin, Ying (NIH/NIEHS) [F]" w:date="2026-01-22T15:43:00Z" w16du:dateUtc="2026-01-22T20:43:00Z">
         <w:r>
           <w:t>the presence of increasing/decreasing trend</w:t>
         </w:r>
       </w:ins>
-      <w:del w:id="7" w:author="Jin, Ying (NIH/NIEHS) [F]" w:date="2026-01-22T15:43:00Z" w16du:dateUtc="2026-01-22T20:43:00Z">
+      <w:del w:id="8" w:author="Jin, Ying (NIH/NIEHS) [F]" w:date="2026-01-22T15:43:00Z" w16du:dateUtc="2026-01-22T20:43:00Z">
         <w:r>
           <w:delText>that the derivative i</w:delText>
         </w:r>
       </w:del>
-      <w:del w:id="8" w:author="Jin, Ying (NIH/NIEHS) [F]" w:date="2026-01-22T15:42:00Z" w16du:dateUtc="2026-01-22T20:42:00Z">
+      <w:del w:id="9" w:author="Jin, Ying (NIH/NIEHS) [F]" w:date="2026-01-22T15:42:00Z" w16du:dateUtc="2026-01-22T20:42:00Z">
         <w:r>
           <w:delText>s monotone</w:delText>
         </w:r>
@@ -693,11 +695,11 @@
       <w:r>
         <w:t xml:space="preserve">.  A non-increasing convex curve can easily be observed with a </w:t>
       </w:r>
-      <w:bookmarkStart w:id="9" w:name="OLE_LINK2"/>
+      <w:bookmarkStart w:id="10" w:name="OLE_LINK2"/>
       <w:r>
         <w:t>sigmoidal</w:t>
       </w:r>
-      <w:bookmarkEnd w:id="9"/>
+      <w:bookmarkEnd w:id="10"/>
       <w:r>
         <w:t xml:space="preserve"> response where the dose was not high enough to reach saturation.   Hence, if a test shows evidence of a monotonically increasing and convex, or monotonically decreasing and concave, the shape being tested could be categorized as hormesis. </w:t>
       </w:r>
@@ -843,7 +845,7 @@
               </m:r>
             </m:sub>
           </m:sSub>
-          <w:bookmarkStart w:id="10" w:name="OLE_LINK3"/>
+          <w:bookmarkStart w:id="11" w:name="OLE_LINK3"/>
           <m:sSub>
             <m:sSubPr>
               <m:ctrlPr>
@@ -919,7 +921,7 @@
               </m:r>
             </m:sub>
           </m:sSub>
-          <w:bookmarkEnd w:id="10"/>
+          <w:bookmarkEnd w:id="11"/>
           <m:sSub>
             <m:sSubPr>
               <m:ctrlPr>
@@ -1374,24 +1376,24 @@
       <w:r>
         <w:t xml:space="preserve">.  </w:t>
       </w:r>
-      <w:commentRangeStart w:id="11"/>
+      <w:commentRangeStart w:id="12"/>
       <w:r>
         <w:t>If all coefficients are positive (negative), the curve will be monotone increasing (decreasing)</w:t>
       </w:r>
-      <w:commentRangeEnd w:id="11"/>
+      <w:commentRangeEnd w:id="12"/>
       <w:r>
         <w:rPr>
           <w:rStyle w:val="CommentReference"/>
           <w:sz w:val="24"/>
           <w:szCs w:val="24"/>
         </w:rPr>
-        <w:commentReference w:id="11"/>
+        <w:commentReference w:id="12"/>
       </w:r>
       <w:r>
         <w:t xml:space="preserve">. </w:t>
       </w:r>
-      <w:commentRangeStart w:id="12"/>
       <w:commentRangeStart w:id="13"/>
+      <w:commentRangeStart w:id="14"/>
       <m:oMath>
         <m:sSub>
           <m:sSubPr>
@@ -1504,23 +1506,23 @@
       <w:r>
         <w:t xml:space="preserve"> are the random effect covariates</w:t>
       </w:r>
-      <w:commentRangeEnd w:id="12"/>
+      <w:commentRangeEnd w:id="13"/>
       <w:r>
         <w:rPr>
           <w:rStyle w:val="CommentReference"/>
           <w:sz w:val="24"/>
           <w:szCs w:val="24"/>
         </w:rPr>
-        <w:commentReference w:id="12"/>
-      </w:r>
-      <w:commentRangeEnd w:id="13"/>
+        <w:commentReference w:id="13"/>
+      </w:r>
+      <w:commentRangeEnd w:id="14"/>
       <w:r>
         <w:rPr>
           <w:rStyle w:val="CommentReference"/>
           <w:sz w:val="24"/>
           <w:szCs w:val="24"/>
         </w:rPr>
-        <w:commentReference w:id="13"/>
+        <w:commentReference w:id="14"/>
       </w:r>
       <w:r>
         <w:t xml:space="preserve"> and </w:t>
@@ -1739,7 +1741,7 @@
       <w:r>
         <w:t xml:space="preserve">. </w:t>
       </w:r>
-      <w:commentRangeStart w:id="14"/>
+      <w:commentRangeStart w:id="15"/>
       <w:r>
         <w:t xml:space="preserve">The C-splines constrain the curve shape just as before: when the coefficients </w:t>
       </w:r>
@@ -1827,14 +1829,14 @@
       <w:r>
         <w:t xml:space="preserve"> are negative. </w:t>
       </w:r>
-      <w:commentRangeEnd w:id="14"/>
+      <w:commentRangeEnd w:id="15"/>
       <w:r>
         <w:rPr>
           <w:rStyle w:val="CommentReference"/>
           <w:sz w:val="24"/>
           <w:szCs w:val="24"/>
         </w:rPr>
-        <w:commentReference w:id="14"/>
+        <w:commentReference w:id="15"/>
       </w:r>
       <w:r>
         <w:t xml:space="preserve">Testing proceeds similarly to the monotonic model above. </w:t>
@@ -1847,7 +1849,7 @@
       <w:r>
         <w:t xml:space="preserve">Note that both monotonicity and convexity tests test a set of coefficients against two constraint domains separately. Therefore, the results will be four different p values </w:t>
       </w:r>
-      <w:bookmarkStart w:id="15" w:name="OLE_LINK1"/>
+      <w:bookmarkStart w:id="16" w:name="OLE_LINK1"/>
       <m:oMath>
         <m:sSub>
           <m:sSubPr>
@@ -1876,7 +1878,7 @@
           </m:sub>
         </m:sSub>
       </m:oMath>
-      <w:bookmarkEnd w:id="15"/>
+      <w:bookmarkEnd w:id="16"/>
       <w:r>
         <w:t xml:space="preserve">, </w:t>
       </w:r>
@@ -2175,18 +2177,18 @@
       <w:r>
         <w:t xml:space="preserve">, which ranks the p values and reject each hypothesis </w:t>
       </w:r>
-      <w:commentRangeStart w:id="16"/>
+      <w:commentRangeStart w:id="17"/>
       <w:r>
         <w:t>sequentially</w:t>
       </w:r>
-      <w:commentRangeEnd w:id="16"/>
+      <w:commentRangeEnd w:id="17"/>
       <w:r>
         <w:rPr>
           <w:rStyle w:val="CommentReference"/>
           <w:sz w:val="24"/>
           <w:szCs w:val="24"/>
         </w:rPr>
-        <w:commentReference w:id="16"/>
+        <w:commentReference w:id="17"/>
       </w:r>
       <w:r>
         <w:t xml:space="preserve">. </w:t>
@@ -2253,12 +2255,12 @@
       <w:r>
         <w:t xml:space="preserve">e </w:t>
       </w:r>
-      <w:ins w:id="17" w:author="Jin, Ying (NIH/NIEHS) [F]" w:date="2026-01-22T16:04:00Z" w16du:dateUtc="2026-01-22T21:04:00Z">
+      <w:ins w:id="18" w:author="Jin, Ying (NIH/NIEHS) [F]" w:date="2026-01-22T16:04:00Z" w16du:dateUtc="2026-01-22T21:04:00Z">
         <w:r>
           <w:t>within resource constraints</w:t>
         </w:r>
       </w:ins>
-      <w:del w:id="18" w:author="Jin, Ying (NIH/NIEHS) [F]" w:date="2026-01-22T16:04:00Z" w16du:dateUtc="2026-01-22T21:04:00Z">
+      <w:del w:id="19" w:author="Jin, Ying (NIH/NIEHS) [F]" w:date="2026-01-22T16:04:00Z" w16du:dateUtc="2026-01-22T21:04:00Z">
         <w:r>
           <w:delText>e for many reasons (e.g. small number of replicates, sparse or skewed dose grid, etc.)</w:delText>
         </w:r>
@@ -2316,15 +2318,15 @@
       <w:pPr>
         <w:spacing w:line="240" w:lineRule="auto"/>
       </w:pPr>
-      <w:commentRangeStart w:id="19"/>
-      <w:commentRangeEnd w:id="19"/>
+      <w:commentRangeStart w:id="20"/>
+      <w:commentRangeEnd w:id="20"/>
       <w:r>
         <w:rPr>
           <w:rStyle w:val="CommentReference"/>
           <w:sz w:val="24"/>
           <w:szCs w:val="24"/>
         </w:rPr>
-        <w:commentReference w:id="19"/>
+        <w:commentReference w:id="20"/>
       </w:r>
     </w:p>
     <w:p>
@@ -2348,28 +2350,28 @@
       <w:r>
         <w:t xml:space="preserve">Scalability and </w:t>
       </w:r>
-      <w:commentRangeStart w:id="20"/>
       <w:commentRangeStart w:id="21"/>
+      <w:commentRangeStart w:id="22"/>
       <w:r>
         <w:t>Visualization</w:t>
       </w:r>
-      <w:commentRangeEnd w:id="20"/>
+      <w:commentRangeEnd w:id="21"/>
       <w:r>
         <w:rPr>
           <w:rStyle w:val="CommentReference"/>
           <w:sz w:val="28"/>
           <w:szCs w:val="28"/>
         </w:rPr>
-        <w:commentReference w:id="20"/>
-      </w:r>
-      <w:commentRangeEnd w:id="21"/>
+        <w:commentReference w:id="21"/>
+      </w:r>
+      <w:commentRangeEnd w:id="22"/>
       <w:r>
         <w:rPr>
           <w:rStyle w:val="CommentReference"/>
           <w:sz w:val="28"/>
           <w:szCs w:val="28"/>
         </w:rPr>
-        <w:commentReference w:id="21"/>
+        <w:commentReference w:id="22"/>
       </w:r>
     </w:p>
     <w:p>
@@ -2520,18 +2522,18 @@
       <w:r>
         <w:t xml:space="preserve">, which will need further investigation or </w:t>
       </w:r>
-      <w:commentRangeStart w:id="22"/>
+      <w:commentRangeStart w:id="23"/>
       <w:r>
         <w:t>validation</w:t>
       </w:r>
-      <w:commentRangeEnd w:id="22"/>
+      <w:commentRangeEnd w:id="23"/>
       <w:r>
         <w:rPr>
           <w:rStyle w:val="CommentReference"/>
           <w:sz w:val="24"/>
           <w:szCs w:val="24"/>
         </w:rPr>
-        <w:commentReference w:id="22"/>
+        <w:commentReference w:id="23"/>
       </w:r>
       <w:r>
         <w:t xml:space="preserve">. </w:t>
@@ -2541,36 +2543,31 @@
       <w:pPr>
         <w:spacing w:line="240" w:lineRule="auto"/>
       </w:pPr>
-    </w:p>
-    <w:p>
-      <w:pPr>
-        <w:spacing w:line="240" w:lineRule="auto"/>
-      </w:pPr>
       <w:r>
         <w:t>As a solution to the issues above, w</w:t>
       </w:r>
-      <w:commentRangeStart w:id="23"/>
       <w:commentRangeStart w:id="24"/>
+      <w:commentRangeStart w:id="25"/>
       <w:r>
         <w:t xml:space="preserve">e developed </w:t>
       </w:r>
-      <w:commentRangeEnd w:id="23"/>
+      <w:commentRangeEnd w:id="24"/>
       <w:r>
         <w:rPr>
           <w:rStyle w:val="CommentReference"/>
           <w:sz w:val="24"/>
           <w:szCs w:val="24"/>
         </w:rPr>
-        <w:commentReference w:id="23"/>
-      </w:r>
-      <w:commentRangeEnd w:id="24"/>
+        <w:commentReference w:id="24"/>
+      </w:r>
+      <w:commentRangeEnd w:id="25"/>
       <w:r>
         <w:rPr>
           <w:rStyle w:val="CommentReference"/>
           <w:sz w:val="24"/>
           <w:szCs w:val="24"/>
         </w:rPr>
-        <w:commentReference w:id="24"/>
+        <w:commentReference w:id="25"/>
       </w:r>
       <w:r>
         <w:t xml:space="preserve">a </w:t>
@@ -2606,7 +2603,19 @@
         <w:t>surface</w:t>
       </w:r>
       <w:r>
-        <w:t xml:space="preserve">. The structure of this figure resembles a scatter plot, where each dose response pair is indicated by a point. The surface is divided into four panels, representing shape classification on two different scales: convex/concave horizontally; decrease/increase vertically. The position of dose-reponse points are determined by the four p values from SHARP test </w:t>
+        <w:t>. The structure of this figure resembles a scatter plot, where each dose response pair is indicated by a point. The surface is divided into four panels, representing shape classification on two different scales: convex/concave horizontally; decrease/increase vertically. The position of dose-re</w:t>
+      </w:r>
+      <w:r>
+        <w:t>s</w:t>
+      </w:r>
+      <w:r>
+        <w:t xml:space="preserve">ponse points </w:t>
+      </w:r>
+      <w:r>
+        <w:t>is</w:t>
+      </w:r>
+      <w:r>
+        <w:t xml:space="preserve"> determined by the four p values from SHARP test </w:t>
       </w:r>
       <w:r>
         <w:t xml:space="preserve">values </w:t>
@@ -3458,11 +3467,11 @@
         <w:t>assigns the dose response point to the</w:t>
       </w:r>
       <w:r>
-        <w:t xml:space="preserve"> side it more likely belongs to along the increase/decrease or convex/concave axis. And among </w:t>
+        <w:t xml:space="preserve"> side it more likely belongs to along the increase/decrease or convex/concave axis. And among points on the same side, points that are more likely to belong here are positioned further </w:t>
       </w:r>
       <w:r>
         <w:lastRenderedPageBreak/>
-        <w:t xml:space="preserve">points on the same side, points that are more likely to belong here are positioned further away from the axis. The panel division shows the shape classification and the distance between points and axis shows the uncertainty of the test. </w:t>
+        <w:t xml:space="preserve">away from the axis. The panel division shows the shape classification and the distance between points and axis shows the uncertainty of the test. </w:t>
       </w:r>
     </w:p>
     <w:p>
@@ -3512,12 +3521,12 @@
       <w:r>
         <w:t xml:space="preserve">the </w:t>
       </w:r>
-      <w:ins w:id="25" w:author="Jin, Ying (NIH/NIEHS) [F]" w:date="2026-01-22T16:11:00Z" w16du:dateUtc="2026-01-22T21:11:00Z">
+      <w:ins w:id="26" w:author="Jin, Ying (NIH/NIEHS) [F]" w:date="2026-01-22T16:11:00Z" w16du:dateUtc="2026-01-22T21:11:00Z">
         <w:r>
           <w:t>layout</w:t>
         </w:r>
       </w:ins>
-      <w:del w:id="26" w:author="Jin, Ying (NIH/NIEHS) [F]" w:date="2026-01-22T16:11:00Z" w16du:dateUtc="2026-01-22T21:11:00Z">
+      <w:del w:id="27" w:author="Jin, Ying (NIH/NIEHS) [F]" w:date="2026-01-22T16:11:00Z" w16du:dateUtc="2026-01-22T21:11:00Z">
         <w:r>
           <w:delText>plotting</w:delText>
         </w:r>
@@ -3572,82 +3581,119 @@
       <w:pPr>
         <w:spacing w:line="240" w:lineRule="auto"/>
       </w:pPr>
+      <w:r>
+        <w:t xml:space="preserve">Figure 1 below shows an example of visualizing test scores of Turmeric (lot90H73) between five different assays. </w:t>
+      </w:r>
+      <w:r>
+        <w:t>The shape classification made by SHARP is indicated by color</w:t>
+      </w:r>
+      <w:r>
+        <w:t>, and points with the same color are repeated tests on the same dose-re</w:t>
+      </w:r>
+      <w:r>
+        <w:t>s</w:t>
+      </w:r>
+      <w:r>
+        <w:t xml:space="preserve">ponse curve. </w:t>
+      </w:r>
+      <w:r>
+        <w:t xml:space="preserve">From this figure, we can clearly see that </w:t>
+      </w:r>
+      <w:r>
+        <w:t xml:space="preserve">p values from repeated test on the same dose-response curve </w:t>
+      </w:r>
+      <w:r>
+        <w:t>are similar, and</w:t>
+      </w:r>
+      <w:r>
+        <w:t xml:space="preserve"> </w:t>
+      </w:r>
+      <w:r>
+        <w:t xml:space="preserve">different shape classification corresponds to different regions on the graph. </w:t>
+      </w:r>
+      <w:r>
+        <w:t>For example, t</w:t>
+      </w:r>
+      <w:r>
+        <w:t xml:space="preserve">he pink points </w:t>
+      </w:r>
+      <w:r>
+        <w:t xml:space="preserve">fall in the lower right corner outside the significance threshold, which </w:t>
+      </w:r>
+      <w:r>
+        <w:t>i</w:t>
+      </w:r>
+      <w:r>
+        <w:t>s</w:t>
+      </w:r>
+      <w:r>
+        <w:t xml:space="preserve"> the region of hormesis with concave curves with </w:t>
+      </w:r>
+      <w:r>
+        <w:t>de</w:t>
+      </w:r>
+      <w:r>
+        <w:t>creasing trend.</w:t>
+      </w:r>
+      <w:r>
+        <w:t xml:space="preserve"> The </w:t>
+      </w:r>
+      <w:r>
+        <w:t xml:space="preserve">dose-response curve </w:t>
+      </w:r>
+      <w:r>
+        <w:t>corresponding</w:t>
+      </w:r>
+      <w:r>
+        <w:t xml:space="preserve"> to this</w:t>
+      </w:r>
+      <w:r>
+        <w:t xml:space="preserve"> assay, </w:t>
+      </w:r>
+      <w:r>
+        <w:t xml:space="preserve">rt-viability-hepg2-glo-0h, </w:t>
+      </w:r>
+      <w:r>
+        <w:t xml:space="preserve">is showed below with the same color, with an upward J-shape. Similarly, teal points </w:t>
+      </w:r>
+      <w:r>
+        <w:t xml:space="preserve">(rt-viability-hek293-flor-p1_0h) fall in the upper left corner, indicating hormesis with increasing J-shape. </w:t>
+      </w:r>
+      <w:r>
+        <w:t xml:space="preserve">For both </w:t>
+      </w:r>
+      <w:r>
+        <w:t>assays</w:t>
+      </w:r>
+      <w:r>
+        <w:t xml:space="preserve">, their clusters of points fall in the same region, reflecting high certainty </w:t>
+      </w:r>
+      <w:r>
+        <w:t xml:space="preserve">of </w:t>
+      </w:r>
+      <w:r>
+        <w:t>shape classification. On the other hand, the red cluster, aromatase-er-aromatase</w:t>
+      </w:r>
+      <w:r>
+        <w:t>-p1_luc, falls on the significance boundary of concavity. It means that across repetitions, the tests c</w:t>
+      </w:r>
+      <w:r>
+        <w:t>onc</w:t>
+      </w:r>
+      <w:r>
+        <w:t xml:space="preserve">lusions changes between </w:t>
+      </w:r>
+      <w:r>
+        <w:t>concave with decreasing trend and decreasing alone</w:t>
+      </w:r>
+      <w:r>
+        <w:t xml:space="preserve">. It is ambiguous whether this assay shows hormesis or simple monotonicity. </w:t>
+      </w:r>
     </w:p>
     <w:p>
       <w:pPr>
         <w:spacing w:line="240" w:lineRule="auto"/>
       </w:pPr>
-      <w:r>
-        <w:t xml:space="preserve">Other Considerations </w:t>
-      </w:r>
-    </w:p>
-    <w:p>
-      <w:pPr>
-        <w:spacing w:line="240" w:lineRule="auto"/>
-      </w:pPr>
-      <w:r>
-        <w:t>% ambiguities: weak p-values vs strong p-values, how to interpret weak results?  More doses needed, specify higher or lower doses needed?</w:t>
-      </w:r>
-    </w:p>
-    <w:p>
-      <w:pPr>
-        <w:spacing w:line="240" w:lineRule="auto"/>
-      </w:pPr>
-      <w:r>
-        <w:t xml:space="preserve">% How did we handle replicates?  </w:t>
-      </w:r>
-    </w:p>
-    <w:p>
-      <w:pPr>
-        <w:spacing w:line="240" w:lineRule="auto"/>
-      </w:pPr>
-      <w:r>
-        <w:t>% for the variability in the pvalue, we used median.  What about the voting approach?  Is the median statistical valid?</w:t>
-      </w:r>
-    </w:p>
-    <w:p>
-      <w:pPr>
-        <w:pStyle w:val="Heading2"/>
-        <w:spacing w:line="240" w:lineRule="auto"/>
-      </w:pPr>
-      <w:r>
-        <w:t>Results</w:t>
-      </w:r>
-    </w:p>
-    <w:p>
-      <w:pPr>
-        <w:spacing w:line="240" w:lineRule="auto"/>
-      </w:pPr>
-      <w:r>
-        <w:t xml:space="preserve">Figure 1 illustrates the results of our analysis as a heatmap.  </w:t>
-      </w:r>
-      <w:r>
-        <w:t xml:space="preserve">Note that the results exclude channel 1 and channel 2 from the BLA assay, since these channels represent complementary signals of cleaved and uncleaved fluorescing proteins, and their ratio is used to determine activity.  </w:t>
-      </w:r>
-      <w:r>
-        <w:t xml:space="preserve">There is significant structure in the figure in the form of horizontal and vertical lines.  This structure implies some assays or chemicals are consistently hormetic.  A large swath of assays for viability over time show hormesis for the </w:t>
-      </w:r>
-      <w:r>
-        <w:t>t</w:t>
-      </w:r>
-      <w:r>
-        <w:t xml:space="preserve">urmeric </w:t>
-      </w:r>
-      <w:r>
-        <w:t xml:space="preserve">botanical group </w:t>
-      </w:r>
-      <w:r>
-        <w:t xml:space="preserve">and </w:t>
-      </w:r>
-      <w:r>
-        <w:t>the quercetin form of gingko</w:t>
-      </w:r>
-      <w:r>
-        <w:t xml:space="preserve">.  </w:t>
-      </w:r>
-      <w:r>
-        <w:t>Goldenseal shows consistent hormetic activity across AHR, ARE, and MMP assays, while the ARE assay also shows activity for guggul, kava kava, and citral.</w:t>
-      </w:r>
     </w:p>
     <w:p>
       <w:pPr>
@@ -3659,10 +3705,10 @@
         </w:rPr>
         <w:lastRenderedPageBreak/>
         <w:drawing>
-          <wp:inline distT="0" distB="0" distL="0" distR="0" wp14:anchorId="5D874573" wp14:editId="2C2E082C">
-            <wp:extent cx="5943600" cy="7924800"/>
-            <wp:effectExtent l="0" t="0" r="0" b="0"/>
-            <wp:docPr id="383121157" name="Picture 2" descr="Diagram&#10;&#10;AI-generated content may be incorrect."/>
+          <wp:inline distT="0" distB="0" distL="0" distR="0" wp14:anchorId="050E04C1" wp14:editId="6DB97EA6">
+            <wp:extent cx="5943600" cy="7132320"/>
+            <wp:effectExtent l="0" t="0" r="0" b="5080"/>
+            <wp:docPr id="1600425332" name="Picture 2" descr="Chart&#10;&#10;AI-generated content may be incorrect."/>
             <wp:cNvGraphicFramePr>
               <a:graphicFrameLocks xmlns:a="http://schemas.openxmlformats.org/drawingml/2006/main" noChangeAspect="1"/>
             </wp:cNvGraphicFramePr>
@@ -3670,11 +3716,188 @@
               <a:graphicData uri="http://schemas.openxmlformats.org/drawingml/2006/picture">
                 <pic:pic xmlns:pic="http://schemas.openxmlformats.org/drawingml/2006/picture">
                   <pic:nvPicPr>
-                    <pic:cNvPr id="383121157" name="Picture 2" descr="Diagram&#10;&#10;AI-generated content may be incorrect."/>
+                    <pic:cNvPr id="1600425332" name="Picture 2" descr="Chart&#10;&#10;AI-generated content may be incorrect."/>
                     <pic:cNvPicPr/>
                   </pic:nvPicPr>
                   <pic:blipFill>
                     <a:blip r:embed="rId9" cstate="print">
+                      <a:extLst>
+                        <a:ext uri="{28A0092B-C50C-407E-A947-70E740481C1C}">
+                          <a14:useLocalDpi xmlns:a14="http://schemas.microsoft.com/office/drawing/2010/main" val="0"/>
+                        </a:ext>
+                      </a:extLst>
+                    </a:blip>
+                    <a:stretch>
+                      <a:fillRect/>
+                    </a:stretch>
+                  </pic:blipFill>
+                  <pic:spPr>
+                    <a:xfrm>
+                      <a:off x="0" y="0"/>
+                      <a:ext cx="5943600" cy="7132320"/>
+                    </a:xfrm>
+                    <a:prstGeom prst="rect">
+                      <a:avLst/>
+                    </a:prstGeom>
+                  </pic:spPr>
+                </pic:pic>
+              </a:graphicData>
+            </a:graphic>
+          </wp:inline>
+        </w:drawing>
+      </w:r>
+    </w:p>
+    <w:p>
+      <w:pPr>
+        <w:spacing w:line="240" w:lineRule="auto"/>
+      </w:pPr>
+      <w:r>
+        <w:rPr>
+          <w:b/>
+          <w:bCs/>
+        </w:rPr>
+        <w:t xml:space="preserve">Figure </w:t>
+      </w:r>
+      <w:r>
+        <w:rPr>
+          <w:b/>
+          <w:bCs/>
+        </w:rPr>
+        <w:t>2</w:t>
+      </w:r>
+      <w:r>
+        <w:t xml:space="preserve">:  </w:t>
+      </w:r>
+      <w:r>
+        <w:t xml:space="preserve">An example of visualizing SHARP test results </w:t>
+      </w:r>
+      <w:r>
+        <w:t xml:space="preserve">of </w:t>
+      </w:r>
+      <w:r>
+        <w:t>Turmeric (lot 90H73)</w:t>
+      </w:r>
+      <w:r>
+        <w:t xml:space="preserve"> and five </w:t>
+      </w:r>
+      <w:r>
+        <w:t xml:space="preserve">assays. </w:t>
+      </w:r>
+      <w:r>
+        <w:t xml:space="preserve">Each color represents a different assay with its shape classification. </w:t>
+      </w:r>
+      <w:r>
+        <w:t>Points with the same color are repeated tests on the same dose-response curve</w:t>
+      </w:r>
+    </w:p>
+    <w:p>
+      <w:pPr>
+        <w:spacing w:line="240" w:lineRule="auto"/>
+      </w:pPr>
+    </w:p>
+    <w:p>
+      <w:pPr>
+        <w:spacing w:line="240" w:lineRule="auto"/>
+      </w:pPr>
+      <w:r>
+        <w:lastRenderedPageBreak/>
+        <w:t xml:space="preserve">Other Considerations </w:t>
+      </w:r>
+    </w:p>
+    <w:p>
+      <w:pPr>
+        <w:spacing w:line="240" w:lineRule="auto"/>
+      </w:pPr>
+      <w:r>
+        <w:t>% ambiguities: weak p-values vs strong p-values, how to interpret weak results?  More doses needed, specify higher or lower doses needed?</w:t>
+      </w:r>
+    </w:p>
+    <w:p>
+      <w:pPr>
+        <w:spacing w:line="240" w:lineRule="auto"/>
+      </w:pPr>
+      <w:r>
+        <w:t xml:space="preserve">% How did we handle replicates?  </w:t>
+      </w:r>
+    </w:p>
+    <w:p>
+      <w:pPr>
+        <w:spacing w:line="240" w:lineRule="auto"/>
+      </w:pPr>
+      <w:r>
+        <w:t>% for the variability in the pvalue, we used median.  What about the voting approach?  Is the median statistical valid?</w:t>
+      </w:r>
+    </w:p>
+    <w:p>
+      <w:pPr>
+        <w:pStyle w:val="Heading2"/>
+        <w:spacing w:line="240" w:lineRule="auto"/>
+      </w:pPr>
+      <w:r>
+        <w:t>Results</w:t>
+      </w:r>
+    </w:p>
+    <w:p>
+      <w:pPr>
+        <w:spacing w:line="240" w:lineRule="auto"/>
+      </w:pPr>
+      <w:r>
+        <w:t xml:space="preserve">Figure 1 illustrates the results of our analysis as a heatmap.  </w:t>
+      </w:r>
+      <w:r>
+        <w:t xml:space="preserve">Note that the results exclude channel 1 and channel 2 from the BLA assay, since these channels represent complementary signals of cleaved and uncleaved fluorescing proteins, and their ratio is used to determine activity.  </w:t>
+      </w:r>
+      <w:r>
+        <w:t xml:space="preserve">There is significant structure in the figure in the form of horizontal and vertical lines.  This structure implies some assays or chemicals are consistently hormetic.  A large swath of assays for viability over time show hormesis for the </w:t>
+      </w:r>
+      <w:r>
+        <w:t>t</w:t>
+      </w:r>
+      <w:r>
+        <w:t xml:space="preserve">urmeric </w:t>
+      </w:r>
+      <w:r>
+        <w:t xml:space="preserve">botanical group </w:t>
+      </w:r>
+      <w:r>
+        <w:t xml:space="preserve">and </w:t>
+      </w:r>
+      <w:r>
+        <w:t>the quercetin form of gingko</w:t>
+      </w:r>
+      <w:r>
+        <w:t xml:space="preserve">.  </w:t>
+      </w:r>
+      <w:r>
+        <w:t>Goldenseal shows consistent hormetic activity across AHR, ARE, and MMP assays, while the ARE assay also shows activity for guggul, kava kava, and citral.</w:t>
+      </w:r>
+    </w:p>
+    <w:p>
+      <w:pPr>
+        <w:spacing w:line="240" w:lineRule="auto"/>
+      </w:pPr>
+      <w:r>
+        <w:rPr>
+          <w:noProof/>
+        </w:rPr>
+        <w:lastRenderedPageBreak/>
+        <w:drawing>
+          <wp:inline distT="0" distB="0" distL="0" distR="0" wp14:anchorId="0C624F0F" wp14:editId="33820085">
+            <wp:extent cx="5943600" cy="7924800"/>
+            <wp:effectExtent l="0" t="0" r="0" b="0"/>
+            <wp:docPr id="352529006" name="Picture 1" descr="Diagram&#10;&#10;AI-generated content may be incorrect."/>
+            <wp:cNvGraphicFramePr>
+              <a:graphicFrameLocks xmlns:a="http://schemas.openxmlformats.org/drawingml/2006/main" noChangeAspect="1"/>
+            </wp:cNvGraphicFramePr>
+            <a:graphic xmlns:a="http://schemas.openxmlformats.org/drawingml/2006/main">
+              <a:graphicData uri="http://schemas.openxmlformats.org/drawingml/2006/picture">
+                <pic:pic xmlns:pic="http://schemas.openxmlformats.org/drawingml/2006/picture">
+                  <pic:nvPicPr>
+                    <pic:cNvPr id="352529006" name="Picture 1" descr="Diagram&#10;&#10;AI-generated content may be incorrect."/>
+                    <pic:cNvPicPr/>
+                  </pic:nvPicPr>
+                  <pic:blipFill>
+                    <a:blip r:embed="rId10" cstate="print">
                       <a:extLst>
                         <a:ext uri="{28A0092B-C50C-407E-A947-70E740481C1C}">
                           <a14:useLocalDpi xmlns:a14="http://schemas.microsoft.com/office/drawing/2010/main" val="0"/>
@@ -3715,28 +3938,28 @@
       <w:r>
         <w:t xml:space="preserve">:  Results </w:t>
       </w:r>
-      <w:commentRangeStart w:id="27"/>
       <w:commentRangeStart w:id="28"/>
+      <w:commentRangeStart w:id="29"/>
       <w:r>
         <w:t>from Shape Analysis</w:t>
       </w:r>
-      <w:commentRangeEnd w:id="27"/>
+      <w:commentRangeEnd w:id="28"/>
       <w:r>
         <w:rPr>
           <w:rStyle w:val="CommentReference"/>
           <w:sz w:val="24"/>
           <w:szCs w:val="24"/>
         </w:rPr>
-        <w:commentReference w:id="27"/>
-      </w:r>
-      <w:commentRangeEnd w:id="28"/>
+        <w:commentReference w:id="28"/>
+      </w:r>
+      <w:commentRangeEnd w:id="29"/>
       <w:r>
         <w:rPr>
           <w:rStyle w:val="CommentReference"/>
           <w:sz w:val="24"/>
           <w:szCs w:val="24"/>
         </w:rPr>
-        <w:commentReference w:id="28"/>
+        <w:commentReference w:id="29"/>
       </w:r>
       <w:r>
         <w:t xml:space="preserve">.  </w:t>
@@ -3940,7 +4163,43 @@
                 <w:sz w:val="21"/>
                 <w:szCs w:val="21"/>
               </w:rPr>
-              <w:t>158 (58.52%)</w:t>
+              <w:t>15</w:t>
+            </w:r>
+            <w:r>
+              <w:rPr>
+                <w:rFonts w:ascii="Helvetica Neue" w:hAnsi="Helvetica Neue"/>
+                <w:color w:val="000000"/>
+                <w:sz w:val="21"/>
+                <w:szCs w:val="21"/>
+              </w:rPr>
+              <w:t>7</w:t>
+            </w:r>
+            <w:r>
+              <w:rPr>
+                <w:rFonts w:ascii="Helvetica Neue" w:hAnsi="Helvetica Neue"/>
+                <w:color w:val="000000"/>
+                <w:sz w:val="21"/>
+                <w:szCs w:val="21"/>
+              </w:rPr>
+              <w:t xml:space="preserve"> (58.</w:t>
+            </w:r>
+            <w:r>
+              <w:rPr>
+                <w:rFonts w:ascii="Helvetica Neue" w:hAnsi="Helvetica Neue"/>
+                <w:color w:val="000000"/>
+                <w:sz w:val="21"/>
+                <w:szCs w:val="21"/>
+              </w:rPr>
+              <w:t>15</w:t>
+            </w:r>
+            <w:r>
+              <w:rPr>
+                <w:rFonts w:ascii="Helvetica Neue" w:hAnsi="Helvetica Neue"/>
+                <w:color w:val="000000"/>
+                <w:sz w:val="21"/>
+                <w:szCs w:val="21"/>
+              </w:rPr>
+              <w:t>%)</w:t>
             </w:r>
           </w:p>
         </w:tc>
@@ -4460,7 +4719,34 @@
                 <w:sz w:val="21"/>
                 <w:szCs w:val="21"/>
               </w:rPr>
-              <w:t>21 (3.24%)</w:t>
+              <w:t>19</w:t>
+            </w:r>
+            <w:r>
+              <w:rPr>
+                <w:rFonts w:ascii="Helvetica Neue" w:hAnsi="Helvetica Neue"/>
+                <w:color w:val="000000"/>
+                <w:sz w:val="21"/>
+                <w:szCs w:val="21"/>
+              </w:rPr>
+              <w:t xml:space="preserve"> (</w:t>
+            </w:r>
+            <w:r>
+              <w:rPr>
+                <w:rFonts w:ascii="Helvetica Neue" w:hAnsi="Helvetica Neue"/>
+                <w:color w:val="000000"/>
+                <w:sz w:val="21"/>
+                <w:szCs w:val="21"/>
+              </w:rPr>
+              <w:t>2.93</w:t>
+            </w:r>
+            <w:r>
+              <w:rPr>
+                <w:rFonts w:ascii="Helvetica Neue" w:hAnsi="Helvetica Neue"/>
+                <w:color w:val="000000"/>
+                <w:sz w:val="21"/>
+                <w:szCs w:val="21"/>
+              </w:rPr>
+              <w:t>%)</w:t>
             </w:r>
           </w:p>
         </w:tc>
@@ -5179,7 +5465,51 @@
                 <w:sz w:val="21"/>
                 <w:szCs w:val="21"/>
               </w:rPr>
-              <w:t>562 (12%)</w:t>
+              <w:t>56</w:t>
+            </w:r>
+            <w:r>
+              <w:rPr>
+                <w:rFonts w:ascii="Helvetica Neue" w:hAnsi="Helvetica Neue"/>
+                <w:b/>
+                <w:bCs/>
+                <w:color w:val="000000"/>
+                <w:sz w:val="21"/>
+                <w:szCs w:val="21"/>
+              </w:rPr>
+              <w:t>1</w:t>
+            </w:r>
+            <w:r>
+              <w:rPr>
+                <w:rFonts w:ascii="Helvetica Neue" w:hAnsi="Helvetica Neue"/>
+                <w:b/>
+                <w:bCs/>
+                <w:color w:val="000000"/>
+                <w:sz w:val="21"/>
+                <w:szCs w:val="21"/>
+              </w:rPr>
+              <w:t xml:space="preserve"> (1</w:t>
+            </w:r>
+            <w:r>
+              <w:rPr>
+                <w:rFonts w:ascii="Helvetica Neue" w:hAnsi="Helvetica Neue"/>
+                <w:b/>
+                <w:bCs/>
+                <w:color w:val="000000"/>
+                <w:sz w:val="21"/>
+                <w:szCs w:val="21"/>
+              </w:rPr>
+              <w:t>1.54</w:t>
+            </w:r>
+            <w:r>
+              <w:rPr>
+                <w:rFonts w:ascii="Helvetica Neue" w:hAnsi="Helvetica Neue"/>
+                <w:b/>
+                <w:bCs/>
+                <w:color w:val="000000"/>
+                <w:sz w:val="21"/>
+                <w:szCs w:val="21"/>
+              </w:rPr>
+              <w:t>%)</w:t>
             </w:r>
           </w:p>
         </w:tc>
@@ -6541,7 +6871,73 @@
                 <w:szCs w:val="21"/>
                 <w14:ligatures w14:val="none"/>
               </w:rPr>
-              <w:t>39 (43.33%)</w:t>
+              <w:t>3</w:t>
+            </w:r>
+            <w:r>
+              <w:rPr>
+                <w:rFonts w:ascii="Helvetica" w:eastAsia="Times New Roman" w:hAnsi="Helvetica" w:cs="Times New Roman"/>
+                <w:color w:val="000000"/>
+                <w:kern w:val="0"/>
+                <w:sz w:val="21"/>
+                <w:szCs w:val="21"/>
+                <w14:ligatures w14:val="none"/>
+              </w:rPr>
+              <w:t>8</w:t>
+            </w:r>
+            <w:r>
+              <w:rPr>
+                <w:rFonts w:ascii="Helvetica" w:eastAsia="Times New Roman" w:hAnsi="Helvetica" w:cs="Times New Roman"/>
+                <w:color w:val="000000"/>
+                <w:kern w:val="0"/>
+                <w:sz w:val="21"/>
+                <w:szCs w:val="21"/>
+                <w14:ligatures w14:val="none"/>
+              </w:rPr>
+              <w:t xml:space="preserve"> (4</w:t>
+            </w:r>
+            <w:r>
+              <w:rPr>
+                <w:rFonts w:ascii="Helvetica" w:eastAsia="Times New Roman" w:hAnsi="Helvetica" w:cs="Times New Roman"/>
+                <w:color w:val="000000"/>
+                <w:kern w:val="0"/>
+                <w:sz w:val="21"/>
+                <w:szCs w:val="21"/>
+                <w14:ligatures w14:val="none"/>
+              </w:rPr>
+              <w:t>2</w:t>
+            </w:r>
+            <w:r>
+              <w:rPr>
+                <w:rFonts w:ascii="Helvetica" w:eastAsia="Times New Roman" w:hAnsi="Helvetica" w:cs="Times New Roman"/>
+                <w:color w:val="000000"/>
+                <w:kern w:val="0"/>
+                <w:sz w:val="21"/>
+                <w:szCs w:val="21"/>
+                <w14:ligatures w14:val="none"/>
+              </w:rPr>
+              <w:t>.</w:t>
+            </w:r>
+            <w:r>
+              <w:rPr>
+                <w:rFonts w:ascii="Helvetica" w:eastAsia="Times New Roman" w:hAnsi="Helvetica" w:cs="Times New Roman"/>
+                <w:color w:val="000000"/>
+                <w:kern w:val="0"/>
+                <w:sz w:val="21"/>
+                <w:szCs w:val="21"/>
+                <w14:ligatures w14:val="none"/>
+              </w:rPr>
+              <w:t>22</w:t>
+            </w:r>
+            <w:r>
+              <w:rPr>
+                <w:rFonts w:ascii="Helvetica" w:eastAsia="Times New Roman" w:hAnsi="Helvetica" w:cs="Times New Roman"/>
+                <w:color w:val="000000"/>
+                <w:kern w:val="0"/>
+                <w:sz w:val="21"/>
+                <w:szCs w:val="21"/>
+                <w14:ligatures w14:val="none"/>
+              </w:rPr>
+              <w:t>%)</w:t>
             </w:r>
           </w:p>
         </w:tc>
@@ -6571,7 +6967,62 @@
                 <w:szCs w:val="21"/>
                 <w14:ligatures w14:val="none"/>
               </w:rPr>
-              <w:t>4 (4.44%)</w:t>
+              <w:t>3</w:t>
+            </w:r>
+            <w:r>
+              <w:rPr>
+                <w:rFonts w:ascii="Helvetica" w:eastAsia="Times New Roman" w:hAnsi="Helvetica" w:cs="Times New Roman"/>
+                <w:color w:val="000000"/>
+                <w:kern w:val="0"/>
+                <w:sz w:val="21"/>
+                <w:szCs w:val="21"/>
+                <w14:ligatures w14:val="none"/>
+              </w:rPr>
+              <w:t xml:space="preserve"> (</w:t>
+            </w:r>
+            <w:r>
+              <w:rPr>
+                <w:rFonts w:ascii="Helvetica" w:eastAsia="Times New Roman" w:hAnsi="Helvetica" w:cs="Times New Roman"/>
+                <w:color w:val="000000"/>
+                <w:kern w:val="0"/>
+                <w:sz w:val="21"/>
+                <w:szCs w:val="21"/>
+                <w14:ligatures w14:val="none"/>
+              </w:rPr>
+              <w:t>3</w:t>
+            </w:r>
+            <w:r>
+              <w:rPr>
+                <w:rFonts w:ascii="Helvetica" w:eastAsia="Times New Roman" w:hAnsi="Helvetica" w:cs="Times New Roman"/>
+                <w:color w:val="000000"/>
+                <w:kern w:val="0"/>
+                <w:sz w:val="21"/>
+                <w:szCs w:val="21"/>
+                <w14:ligatures w14:val="none"/>
+              </w:rPr>
+              <w:t>.</w:t>
+            </w:r>
+            <w:r>
+              <w:rPr>
+                <w:rFonts w:ascii="Helvetica" w:eastAsia="Times New Roman" w:hAnsi="Helvetica" w:cs="Times New Roman"/>
+                <w:color w:val="000000"/>
+                <w:kern w:val="0"/>
+                <w:sz w:val="21"/>
+                <w:szCs w:val="21"/>
+                <w14:ligatures w14:val="none"/>
+              </w:rPr>
+              <w:t>33</w:t>
+            </w:r>
+            <w:r>
+              <w:rPr>
+                <w:rFonts w:ascii="Helvetica" w:eastAsia="Times New Roman" w:hAnsi="Helvetica" w:cs="Times New Roman"/>
+                <w:color w:val="000000"/>
+                <w:kern w:val="0"/>
+                <w:sz w:val="21"/>
+                <w:szCs w:val="21"/>
+                <w14:ligatures w14:val="none"/>
+              </w:rPr>
+              <w:t>%)</w:t>
             </w:r>
           </w:p>
         </w:tc>
@@ -7835,7 +8286,73 @@
                 <w:szCs w:val="21"/>
                 <w14:ligatures w14:val="none"/>
               </w:rPr>
-              <w:t>14 (15.56%)</w:t>
+              <w:t>1</w:t>
+            </w:r>
+            <w:r>
+              <w:rPr>
+                <w:rFonts w:ascii="Helvetica Neue" w:eastAsia="Times New Roman" w:hAnsi="Helvetica Neue" w:cs="Times New Roman"/>
+                <w:color w:val="000000"/>
+                <w:kern w:val="0"/>
+                <w:sz w:val="21"/>
+                <w:szCs w:val="21"/>
+                <w14:ligatures w14:val="none"/>
+              </w:rPr>
+              <w:t>6</w:t>
+            </w:r>
+            <w:r>
+              <w:rPr>
+                <w:rFonts w:ascii="Helvetica Neue" w:eastAsia="Times New Roman" w:hAnsi="Helvetica Neue" w:cs="Times New Roman"/>
+                <w:color w:val="000000"/>
+                <w:kern w:val="0"/>
+                <w:sz w:val="21"/>
+                <w:szCs w:val="21"/>
+                <w14:ligatures w14:val="none"/>
+              </w:rPr>
+              <w:t xml:space="preserve"> (1</w:t>
+            </w:r>
+            <w:r>
+              <w:rPr>
+                <w:rFonts w:ascii="Helvetica Neue" w:eastAsia="Times New Roman" w:hAnsi="Helvetica Neue" w:cs="Times New Roman"/>
+                <w:color w:val="000000"/>
+                <w:kern w:val="0"/>
+                <w:sz w:val="21"/>
+                <w:szCs w:val="21"/>
+                <w14:ligatures w14:val="none"/>
+              </w:rPr>
+              <w:t>6</w:t>
+            </w:r>
+            <w:r>
+              <w:rPr>
+                <w:rFonts w:ascii="Helvetica Neue" w:eastAsia="Times New Roman" w:hAnsi="Helvetica Neue" w:cs="Times New Roman"/>
+                <w:color w:val="000000"/>
+                <w:kern w:val="0"/>
+                <w:sz w:val="21"/>
+                <w:szCs w:val="21"/>
+                <w14:ligatures w14:val="none"/>
+              </w:rPr>
+              <w:t>.</w:t>
+            </w:r>
+            <w:r>
+              <w:rPr>
+                <w:rFonts w:ascii="Helvetica Neue" w:eastAsia="Times New Roman" w:hAnsi="Helvetica Neue" w:cs="Times New Roman"/>
+                <w:color w:val="000000"/>
+                <w:kern w:val="0"/>
+                <w:sz w:val="21"/>
+                <w:szCs w:val="21"/>
+                <w14:ligatures w14:val="none"/>
+              </w:rPr>
+              <w:t>67</w:t>
+            </w:r>
+            <w:r>
+              <w:rPr>
+                <w:rFonts w:ascii="Helvetica Neue" w:eastAsia="Times New Roman" w:hAnsi="Helvetica Neue" w:cs="Times New Roman"/>
+                <w:color w:val="000000"/>
+                <w:kern w:val="0"/>
+                <w:sz w:val="21"/>
+                <w:szCs w:val="21"/>
+                <w14:ligatures w14:val="none"/>
+              </w:rPr>
+              <w:t>%)</w:t>
             </w:r>
           </w:p>
         </w:tc>
@@ -8365,7 +8882,7 @@
       <w:r>
         <w:t>In addition to the time</w:t>
       </w:r>
-      <w:ins w:id="29" w:author="Jin, Ying (NIH/NIEHS) [F]" w:date="2026-01-22T16:23:00Z" w16du:dateUtc="2026-01-22T21:23:00Z">
+      <w:ins w:id="30" w:author="Jin, Ying (NIH/NIEHS) [F]" w:date="2026-01-22T16:23:00Z" w16du:dateUtc="2026-01-22T21:23:00Z">
         <w:r>
           <w:t xml:space="preserve"> </w:t>
         </w:r>
@@ -8425,11 +8942,11 @@
       <w:r>
         <w:t>The heatmap and tables provide summary views of the hormetic tests but do not allow us to compare the strength of the signals revealed by the SHARP test</w:t>
       </w:r>
-      <w:commentRangeStart w:id="30"/>
+      <w:commentRangeStart w:id="31"/>
       <w:r>
         <w:t>.  I</w:t>
       </w:r>
-      <w:commentRangeStart w:id="31"/>
+      <w:commentRangeStart w:id="32"/>
       <w:r>
         <w:t xml:space="preserve">nstead, we provide a </w:t>
       </w:r>
@@ -8442,26 +8959,26 @@
       <w:r>
         <w:t xml:space="preserve"> </w:t>
       </w:r>
-      <w:commentRangeEnd w:id="31"/>
+      <w:commentRangeEnd w:id="32"/>
       <w:r>
         <w:rPr>
           <w:rStyle w:val="CommentReference"/>
           <w:sz w:val="24"/>
           <w:szCs w:val="24"/>
         </w:rPr>
-        <w:commentReference w:id="31"/>
+        <w:commentReference w:id="32"/>
       </w:r>
       <w:r>
         <w:t xml:space="preserve"> </w:t>
       </w:r>
-      <w:commentRangeEnd w:id="30"/>
+      <w:commentRangeEnd w:id="31"/>
       <w:r>
         <w:rPr>
           <w:rStyle w:val="CommentReference"/>
           <w:sz w:val="24"/>
           <w:szCs w:val="24"/>
         </w:rPr>
-        <w:commentReference w:id="30"/>
+        <w:commentReference w:id="31"/>
       </w:r>
       <w:r>
         <w:t xml:space="preserve">In figure 2 below, we illustrate the ARE assay results, showing the high frequency of convex increasing dose responses but also the relative strength (top left corner) or ambiguity (points on the dotted lines) of the shape classification.  </w:t>
@@ -8479,28 +8996,16 @@
       <w:pPr>
         <w:spacing w:line="240" w:lineRule="auto"/>
       </w:pPr>
-    </w:p>
-    <w:p>
-      <w:pPr>
-        <w:spacing w:line="240" w:lineRule="auto"/>
-        <w:jc w:val="center"/>
-      </w:pPr>
-      <w:commentRangeStart w:id="32"/>
-      <w:r>
-        <w:rPr>
-          <w:noProof/>
-        </w:rPr>
+      <w:r>
+        <w:rPr>
+          <w:noProof/>
+        </w:rPr>
+        <w:lastRenderedPageBreak/>
         <w:drawing>
-          <wp:inline distT="0" distB="0" distL="0" distR="0" wp14:anchorId="7B472777" wp14:editId="7D3CCC60">
-            <wp:extent cx="3915177" cy="3131725"/>
-            <wp:effectExtent l="0" t="0" r="0" b="5715"/>
-            <wp:docPr id="5" name="Picture 4">
-              <a:extLst xmlns:a="http://schemas.openxmlformats.org/drawingml/2006/main">
-                <a:ext uri="{FF2B5EF4-FFF2-40B4-BE49-F238E27FC236}">
-                  <a16:creationId xmlns:a16="http://schemas.microsoft.com/office/drawing/2014/main" id="{1CE56720-AD8F-A2ED-305B-AD724F0DE687}"/>
-                </a:ext>
-              </a:extLst>
-            </wp:docPr>
+          <wp:inline distT="0" distB="0" distL="0" distR="0" wp14:anchorId="055CA571" wp14:editId="24B7B5AE">
+            <wp:extent cx="5943600" cy="4754880"/>
+            <wp:effectExtent l="0" t="0" r="0" b="0"/>
+            <wp:docPr id="1513439609" name="Picture 2" descr="Chart, scatter chart&#10;&#10;AI-generated content may be incorrect."/>
             <wp:cNvGraphicFramePr>
               <a:graphicFrameLocks xmlns:a="http://schemas.openxmlformats.org/drawingml/2006/main" noChangeAspect="1"/>
             </wp:cNvGraphicFramePr>
@@ -8508,42 +9013,29 @@
               <a:graphicData uri="http://schemas.openxmlformats.org/drawingml/2006/picture">
                 <pic:pic xmlns:pic="http://schemas.openxmlformats.org/drawingml/2006/picture">
                   <pic:nvPicPr>
-                    <pic:cNvPr id="5" name="Picture 4">
-                      <a:extLst>
-                        <a:ext uri="{FF2B5EF4-FFF2-40B4-BE49-F238E27FC236}">
-                          <a16:creationId xmlns:a16="http://schemas.microsoft.com/office/drawing/2014/main" id="{1CE56720-AD8F-A2ED-305B-AD724F0DE687}"/>
-                        </a:ext>
-                      </a:extLst>
-                    </pic:cNvPr>
-                    <pic:cNvPicPr>
-                      <a:picLocks noChangeAspect="1"/>
-                    </pic:cNvPicPr>
+                    <pic:cNvPr id="1513439609" name="Picture 2" descr="Chart, scatter chart&#10;&#10;AI-generated content may be incorrect."/>
+                    <pic:cNvPicPr/>
                   </pic:nvPicPr>
                   <pic:blipFill>
-                    <a:blip r:embed="rId10" cstate="print">
+                    <a:blip r:embed="rId11">
                       <a:extLst>
                         <a:ext uri="{28A0092B-C50C-407E-A947-70E740481C1C}">
                           <a14:useLocalDpi xmlns:a14="http://schemas.microsoft.com/office/drawing/2010/main" val="0"/>
                         </a:ext>
                       </a:extLst>
                     </a:blip>
-                    <a:srcRect/>
                     <a:stretch>
                       <a:fillRect/>
                     </a:stretch>
                   </pic:blipFill>
-                  <pic:spPr bwMode="auto">
+                  <pic:spPr>
                     <a:xfrm>
                       <a:off x="0" y="0"/>
-                      <a:ext cx="3961477" cy="3168760"/>
+                      <a:ext cx="5943600" cy="4754880"/>
                     </a:xfrm>
                     <a:prstGeom prst="rect">
                       <a:avLst/>
                     </a:prstGeom>
-                    <a:noFill/>
-                    <a:ln>
-                      <a:noFill/>
-                    </a:ln>
                   </pic:spPr>
                 </pic:pic>
               </a:graphicData>
@@ -8551,15 +9043,12 @@
           </wp:inline>
         </w:drawing>
       </w:r>
-      <w:commentRangeEnd w:id="32"/>
-      <w:r>
-        <w:rPr>
-          <w:rStyle w:val="CommentReference"/>
-          <w:sz w:val="24"/>
-          <w:szCs w:val="24"/>
-        </w:rPr>
-        <w:commentReference w:id="32"/>
-      </w:r>
+    </w:p>
+    <w:p>
+      <w:pPr>
+        <w:spacing w:line="240" w:lineRule="auto"/>
+        <w:jc w:val="center"/>
+      </w:pPr>
     </w:p>
     <w:p>
       <w:pPr>
@@ -8638,7 +9127,11 @@
         <w:t>3</w:t>
       </w:r>
       <w:r>
-        <w:t xml:space="preserve"> below, the U-shaped curves could be revealed as hormetic dose responses with higher doses.  Similarly, the aromatase assay for kava kava shows a cluster of hormetic curves mixed with monotone curves that could be hormetic with more tested doses </w:t>
+        <w:t xml:space="preserve"> below, the U-shaped curves could be revealed as hormetic dose responses with higher doses.  Similarly, the aromatase assay for kava kava shows a cluster of hormetic curves mixed with </w:t>
+      </w:r>
+      <w:r>
+        <w:lastRenderedPageBreak/>
+        <w:t xml:space="preserve">monotone curves that could be hormetic with more tested doses </w:t>
       </w:r>
       <w:r>
         <w:t>on the lower end</w:t>
@@ -8670,7 +9163,6 @@
         <w:rPr>
           <w:noProof/>
         </w:rPr>
-        <w:lastRenderedPageBreak/>
         <w:drawing>
           <wp:inline distT="0" distB="0" distL="0" distR="0" wp14:anchorId="04619CBB" wp14:editId="04DB0BE5">
             <wp:extent cx="2150225" cy="1536860"/>
@@ -8687,7 +9179,7 @@
                     <pic:cNvPicPr/>
                   </pic:nvPicPr>
                   <pic:blipFill>
-                    <a:blip r:embed="rId11"/>
+                    <a:blip r:embed="rId12"/>
                     <a:stretch>
                       <a:fillRect/>
                     </a:stretch>
@@ -8727,7 +9219,7 @@
                     <pic:cNvPicPr/>
                   </pic:nvPicPr>
                   <pic:blipFill>
-                    <a:blip r:embed="rId12"/>
+                    <a:blip r:embed="rId13"/>
                     <a:stretch>
                       <a:fillRect/>
                     </a:stretch>
@@ -8958,7 +9450,11 @@
         <w:t xml:space="preserve"> (edges)</w:t>
       </w:r>
       <w:r>
-        <w:t xml:space="preserve"> and highly ambiguous results</w:t>
+        <w:t xml:space="preserve"> and </w:t>
+      </w:r>
+      <w:r>
+        <w:lastRenderedPageBreak/>
+        <w:t>highly ambiguous results</w:t>
       </w:r>
       <w:r>
         <w:t xml:space="preserve"> (near significant thresholds)</w:t>
@@ -8985,11 +9481,7 @@
         <w:t xml:space="preserve">n pvalue or the most frequent shape category returned as the mode.  </w:t>
       </w:r>
       <w:r>
-        <w:t xml:space="preserve">Specifying hormesis more precisely is a direction for future work: in addition to reducing the variability of the testing procedure with SHARP, it may be helpful to explicitly test for a J shaped curve </w:t>
-      </w:r>
-      <w:r>
-        <w:lastRenderedPageBreak/>
-        <w:t xml:space="preserve">rather than the less precise increasing-convex or decreasing-concave approach.  </w:t>
+        <w:t xml:space="preserve">Specifying hormesis more precisely is a direction for future work: in addition to reducing the variability of the testing procedure with SHARP, it may be helpful to explicitly test for a J shaped curve rather than the less precise increasing-convex or decreasing-concave approach.  </w:t>
       </w:r>
       <w:r>
         <w:t xml:space="preserve">It is also not clear how to handle replicates, where each replicate may have a different shape.   </w:t>
@@ -9893,6 +10385,7 @@
         <w:spacing w:line="240" w:lineRule="auto"/>
       </w:pPr>
       <w:r>
+        <w:lastRenderedPageBreak/>
         <w:t>Theorem 1 of</w:t>
       </w:r>
       <w:r>
@@ -9923,7 +10416,6 @@
         <w:spacing w:line="240" w:lineRule="auto"/>
       </w:pPr>
       <w:r>
-        <w:lastRenderedPageBreak/>
         <w:t xml:space="preserve">Test </w:t>
       </w:r>
       <w:commentRangeStart w:id="36"/>
@@ -10273,6 +10765,7 @@
         <w:rPr>
           <w:noProof/>
         </w:rPr>
+        <w:lastRenderedPageBreak/>
         <w:t xml:space="preserve">Hubbard, T. D., J.-H. Hsieh, C. V. Rider, N. S. Sipes, A. Sedykh, B. J. Collins, S. S. Auerbach, M. Xia, R. Huang, N. J. Walker and et al. (2019). "Using Tox21 high-throughput screening assays for the evaluation of botanical and dietary supplements." </w:t>
       </w:r>
       <w:r>
@@ -10396,7 +10889,6 @@
         <w:rPr>
           <w:noProof/>
         </w:rPr>
-        <w:lastRenderedPageBreak/>
         <w:t xml:space="preserve">Ramsay, J. (1988). "Monotone Regression Splines in Action." </w:t>
       </w:r>
       <w:r>
@@ -10709,7 +11201,7 @@
 
 <file path=word/comments.xml><?xml version="1.0" encoding="utf-8"?>
 <w:comments xmlns:wpc="http://schemas.microsoft.com/office/word/2010/wordprocessingCanvas" xmlns:cx="http://schemas.microsoft.com/office/drawing/2014/chartex" xmlns:cx1="http://schemas.microsoft.com/office/drawing/2015/9/8/chartex" xmlns:cx2="http://schemas.microsoft.com/office/drawing/2015/10/21/chartex" xmlns:cx3="http://schemas.microsoft.com/office/drawing/2016/5/9/chartex" xmlns:cx4="http://schemas.microsoft.com/office/drawing/2016/5/10/chartex" xmlns:cx5="http://schemas.microsoft.com/office/drawing/2016/5/11/chartex" xmlns:cx6="http://schemas.microsoft.com/office/drawing/2016/5/12/chartex" xmlns:cx7="http://schemas.microsoft.com/office/drawing/2016/5/13/chartex" xmlns:cx8="http://schemas.microsoft.com/office/drawing/2016/5/14/chartex" xmlns:mc="http://schemas.openxmlformats.org/markup-compatibility/2006" xmlns:aink="http://schemas.microsoft.com/office/drawing/2016/ink" xmlns:am3d="http://schemas.microsoft.com/office/drawing/2017/model3d" xmlns:o="urn:schemas-microsoft-com:office:office" xmlns:oel="http://schemas.microsoft.com/office/2019/extlst" xmlns:r="http://schemas.openxmlformats.org/officeDocument/2006/relationships" xmlns:m="http://schemas.openxmlformats.org/officeDocument/2006/math" xmlns:v="urn:schemas-microsoft-com:vml" xmlns:wp14="http://schemas.microsoft.com/office/word/2010/wordprocessingDrawing" xmlns:wp="http://schemas.openxmlformats.org/drawingml/2006/wordprocessingDrawing" xmlns:w10="urn:schemas-microsoft-com:office:word" xmlns:w="http://schemas.openxmlformats.org/wordprocessingml/2006/main" xmlns:w14="http://schemas.microsoft.com/office/word/2010/wordml" xmlns:w15="http://schemas.microsoft.com/office/word/2012/wordml" xmlns:w16cex="http://schemas.microsoft.com/office/word/2018/wordml/cex" xmlns:w16cid="http://schemas.microsoft.com/office/word/2016/wordml/cid" xmlns:w16="http://schemas.microsoft.com/office/word/2018/wordml" xmlns:w16du="http://schemas.microsoft.com/office/word/2023/wordml/word16du" xmlns:w16sdtdh="http://schemas.microsoft.com/office/word/2020/wordml/sdtdatahash" xmlns:w16sdtfl="http://schemas.microsoft.com/office/word/2024/wordml/sdtformatlock" xmlns:w16se="http://schemas.microsoft.com/office/word/2015/wordml/symex" xmlns:wpg="http://schemas.microsoft.com/office/word/2010/wordprocessingGroup" xmlns:wpi="http://schemas.microsoft.com/office/word/2010/wordprocessingInk" xmlns:wne="http://schemas.microsoft.com/office/word/2006/wordml" xmlns:wps="http://schemas.microsoft.com/office/word/2010/wordprocessingShape" mc:Ignorable="w14 w15 w16se w16cid w16 w16cex w16sdtdh w16sdtfl w16du wp14">
-  <w:comment w:id="11" w:author="Jin, Ying (NIH/NIEHS) [F]" w:date="2026-01-22T15:49:00Z" w:initials="JY([">
+  <w:comment w:id="12" w:author="Jin, Ying (NIH/NIEHS) [F]" w:date="2026-01-22T15:49:00Z" w:initials="JY([">
     <w:p>
       <w:r>
         <w:rPr>
@@ -10726,7 +11218,7 @@
       </w:r>
     </w:p>
   </w:comment>
-  <w:comment w:id="12" w:author="Jin, Ying (NIH/NIEHS) [F]" w:date="2026-01-22T15:47:00Z" w:initials="JY([">
+  <w:comment w:id="13" w:author="Jin, Ying (NIH/NIEHS) [F]" w:date="2026-01-22T15:47:00Z" w:initials="JY([">
     <w:p>
       <w:r>
         <w:rPr>
@@ -10744,7 +11236,7 @@
     </w:p>
     <w:p/>
   </w:comment>
-  <w:comment w:id="13" w:author="Jin, Ying (NIH/NIEHS) [F]" w:date="2026-01-23T15:26:00Z" w:initials="JY([">
+  <w:comment w:id="14" w:author="Jin, Ying (NIH/NIEHS) [F]" w:date="2026-01-23T15:26:00Z" w:initials="JY([">
     <w:p>
       <w:r>
         <w:rPr>
@@ -10761,7 +11253,7 @@
       </w:r>
     </w:p>
   </w:comment>
-  <w:comment w:id="14" w:author="Jin, Ying (NIH/NIEHS) [F]" w:date="2026-01-22T15:50:00Z" w:initials="JY([">
+  <w:comment w:id="15" w:author="Jin, Ying (NIH/NIEHS) [F]" w:date="2026-01-22T15:50:00Z" w:initials="JY([">
     <w:p>
       <w:r>
         <w:rPr>
@@ -10778,7 +11270,7 @@
       </w:r>
     </w:p>
   </w:comment>
-  <w:comment w:id="16" w:author="Jin, Ying (NIH/NIEHS) [F]" w:date="2026-01-23T15:42:00Z" w:initials="JY([">
+  <w:comment w:id="17" w:author="Jin, Ying (NIH/NIEHS) [F]" w:date="2026-01-23T15:42:00Z" w:initials="JY([">
     <w:p>
       <w:r>
         <w:rPr>
@@ -10795,7 +11287,7 @@
       </w:r>
     </w:p>
   </w:comment>
-  <w:comment w:id="19" w:author="Jin, Ying (NIH/NIEHS) [F]" w:date="2026-01-22T16:14:00Z" w:initials="JY([">
+  <w:comment w:id="20" w:author="Jin, Ying (NIH/NIEHS) [F]" w:date="2026-01-22T16:14:00Z" w:initials="JY([">
     <w:p>
       <w:r>
         <w:rPr>
@@ -10812,7 +11304,7 @@
       </w:r>
     </w:p>
   </w:comment>
-  <w:comment w:id="20" w:author="Jin, Ying (NIH/NIEHS) [F]" w:date="2026-01-23T15:41:00Z" w:initials="JY([">
+  <w:comment w:id="21" w:author="Jin, Ying (NIH/NIEHS) [F]" w:date="2026-01-23T15:41:00Z" w:initials="JY([">
     <w:p>
       <w:r>
         <w:rPr>
@@ -10829,7 +11321,7 @@
       </w:r>
     </w:p>
   </w:comment>
-  <w:comment w:id="21" w:author="Jin, Ying (NIH/NIEHS) [F]" w:date="2026-02-12T16:20:00Z" w:initials="JY([">
+  <w:comment w:id="22" w:author="Jin, Ying (NIH/NIEHS) [F]" w:date="2026-02-12T16:20:00Z" w:initials="JY([">
     <w:p>
       <w:r>
         <w:rPr>
@@ -10846,7 +11338,7 @@
       </w:r>
     </w:p>
   </w:comment>
-  <w:comment w:id="22" w:author="Jin, Ying (NIH/NIEHS) [F]" w:date="2026-02-12T16:23:00Z" w:initials="JY([">
+  <w:comment w:id="23" w:author="Jin, Ying (NIH/NIEHS) [F]" w:date="2026-02-12T16:23:00Z" w:initials="JY([">
     <w:p>
       <w:r>
         <w:rPr>
@@ -10863,7 +11355,7 @@
       </w:r>
     </w:p>
   </w:comment>
-  <w:comment w:id="23" w:author="Zilber, Daniel (NIH/NIEHS) [E]" w:date="2026-01-22T14:43:00Z" w:initials="DZ">
+  <w:comment w:id="24" w:author="Zilber, Daniel (NIH/NIEHS) [E]" w:date="2026-01-22T14:43:00Z" w:initials="DZ">
     <w:p>
       <w:r>
         <w:rPr>
@@ -10881,7 +11373,7 @@
       </w:r>
     </w:p>
   </w:comment>
-  <w:comment w:id="24" w:author="Jin, Ying (NIH/NIEHS) [F]" w:date="2026-01-23T15:59:00Z" w:initials="JY([">
+  <w:comment w:id="25" w:author="Jin, Ying (NIH/NIEHS) [F]" w:date="2026-01-23T15:59:00Z" w:initials="JY([">
     <w:p>
       <w:r>
         <w:rPr>
@@ -10898,7 +11390,7 @@
       </w:r>
     </w:p>
   </w:comment>
-  <w:comment w:id="27" w:author="Zilber, Daniel (NIH/NIEHS) [E]" w:date="2026-01-22T14:45:00Z" w:initials="DZ">
+  <w:comment w:id="28" w:author="Zilber, Daniel (NIH/NIEHS) [E]" w:date="2026-01-22T14:45:00Z" w:initials="DZ">
     <w:p>
       <w:r>
         <w:rPr>
@@ -10916,7 +11408,7 @@
       </w:r>
     </w:p>
   </w:comment>
-  <w:comment w:id="28" w:author="Jin, Ying (NIH/NIEHS) [F]" w:date="2026-02-12T15:34:00Z" w:initials="JY([">
+  <w:comment w:id="29" w:author="Jin, Ying (NIH/NIEHS) [F]" w:date="2026-02-12T15:34:00Z" w:initials="JY([">
     <w:p>
       <w:r>
         <w:rPr>
@@ -10933,7 +11425,7 @@
       </w:r>
     </w:p>
   </w:comment>
-  <w:comment w:id="31" w:author="Jin, Ying (NIH/NIEHS) [F]" w:date="2026-02-12T16:34:00Z" w:initials="JY([">
+  <w:comment w:id="32" w:author="Jin, Ying (NIH/NIEHS) [F]" w:date="2026-02-12T16:34:00Z" w:initials="JY([">
     <w:p>
       <w:r>
         <w:rPr>
@@ -10950,7 +11442,7 @@
       </w:r>
     </w:p>
   </w:comment>
-  <w:comment w:id="30" w:author="Jin, Ying (NIH/NIEHS) [F]" w:date="2026-01-22T16:24:00Z" w:initials="JY([">
+  <w:comment w:id="31" w:author="Jin, Ying (NIH/NIEHS) [F]" w:date="2026-01-22T16:24:00Z" w:initials="JY([">
     <w:p>
       <w:r>
         <w:rPr>
@@ -10964,23 +11456,6 @@
           <w:szCs w:val="20"/>
         </w:rPr>
         <w:t xml:space="preserve">Actually, is it better to explain the visualization scheme in the result section? </w:t>
-      </w:r>
-    </w:p>
-  </w:comment>
-  <w:comment w:id="32" w:author="Jin, Ying (NIH/NIEHS) [F]" w:date="2026-01-23T15:53:00Z" w:initials="JY([">
-    <w:p>
-      <w:r>
-        <w:rPr>
-          <w:rStyle w:val="CommentReference"/>
-        </w:rPr>
-        <w:annotationRef/>
-      </w:r>
-      <w:r>
-        <w:rPr>
-          <w:sz w:val="20"/>
-          <w:szCs w:val="20"/>
-        </w:rPr>
-        <w:t>Plot repititions of the same curve</w:t>
       </w:r>
     </w:p>
   </w:comment>
@@ -11073,7 +11548,6 @@
   <w15:commentEx w15:paraId="2A484E91" w15:paraIdParent="28375281" w15:done="1"/>
   <w15:commentEx w15:paraId="1D7F53F4" w15:done="0"/>
   <w15:commentEx w15:paraId="17A3905A" w15:done="1"/>
-  <w15:commentEx w15:paraId="2E4B1DC9" w15:done="1"/>
   <w15:commentEx w15:paraId="5EDD8670" w15:done="0"/>
   <w15:commentEx w15:paraId="7796373C" w15:paraIdParent="5EDD8670" w15:done="0"/>
   <w15:commentEx w15:paraId="28AB40C9" w15:done="0"/>
@@ -11182,7 +11656,6 @@
       </w16:ext>
     </w16cex:extLst>
   </w16cex:commentExtensible>
-  <w16cex:commentExtensible w16cex:durableId="0294B25C" w16cex:dateUtc="2026-01-23T20:53:00Z"/>
   <w16cex:commentExtensible w16cex:durableId="4AEEB44F" w16cex:dateUtc="2026-02-12T21:05:00Z"/>
   <w16cex:commentExtensible w16cex:durableId="653FD6D7" w16cex:dateUtc="2026-02-12T21:42:00Z"/>
   <w16cex:commentExtensible w16cex:durableId="042ABE43" w16cex:dateUtc="2026-02-12T21:38:00Z"/>
@@ -11219,7 +11692,6 @@
   <w16cid:commentId w16cid:paraId="2A484E91" w16cid:durableId="6B9FE706"/>
   <w16cid:commentId w16cid:paraId="1D7F53F4" w16cid:durableId="2BD841C9"/>
   <w16cid:commentId w16cid:paraId="17A3905A" w16cid:durableId="7B905E81"/>
-  <w16cid:commentId w16cid:paraId="2E4B1DC9" w16cid:durableId="0294B25C"/>
   <w16cid:commentId w16cid:paraId="5EDD8670" w16cid:durableId="4AEEB44F"/>
   <w16cid:commentId w16cid:paraId="7796373C" w16cid:durableId="653FD6D7"/>
   <w16cid:commentId w16cid:paraId="28AB40C9" w16cid:durableId="042ABE43"/>

</xml_diff>